<commit_message>
Prove free-operator UI Accept→Confirm and scope #16 to busy slots.
Appium FreeOperatorUiAcceptTest on F7D066 completes Assign Confirm when
Nauman is free; dashboard and bug sheet record that #16 is busy-only.

Co-authored-by: Cursor <cursoragent@cursor.com>
</commit_message>
<xml_diff>
--- a/docs/BUGS_FOUND.docx
+++ b/docs/BUGS_FOUND.docx
@@ -1482,7 +1482,7 @@
           </w:tcPr>
           <w:p>
             <w:r>
-              <w:t>Closing Quick Booking (X) lands on Home, but a Request to extend time dialog covers the Home screen (Excavator 20 Tonnes, Accept/Decline). The user cannot use Home until they act on that dialog. Expected: Close should reach a usable Home, or the extend request should not block Home after dismissing the pending queue. Observed 18 Sep on com.l2b.app.qa with 9000000001 (QuickBookingLandingTest.closeReturnsToHome). Tests did not tap Accept/Decline on this dialog.</w:t>
+              <w:t>ESCALATED Medium → High (21 Sep). Closing Quick Booking (X) lands on Home, but Request to extend time fully blocks Home — not a dim overlay you can work around. The UiAutomator tree is only this dialog (Home greeting, earning, tabs are gone from a11y). Android reports dismissable=false. No Close/X, Not now, Remind me later, checkbox, or scrim. Outside tap and device Back do not dismiss; Back stays in Vendor on the same dialog. The only clickable actions are View More Details, Decline, and Accept (Decline/Accept are clickable outer Views; inner labels are decoys). Machine thumbnail is not clickable. A vendor cannot use Home, Calendar, Fleet, Earning, or Profile until they Accept or Decline the extension (a booking decision). Expected: Close reaches a usable Home, or the dialog has a non-committal dismiss (X / Not now) and does not steal the accessibility tree. Observed 18 Sep (QuickBookingLandingTest.closeReturnsToHome) and reconfirmed 21 Sep on com.l2b.app.qa with 9000000001 (RentalHomeDump.dumpHome0001, dumps /tmp/l2b-home-rental-0001-20260921/01-after-close and 03-after-back). Tests did not tap Accept, Decline, or View More Details.</w:t>
             </w:r>
           </w:p>
         </w:tc>
@@ -1492,7 +1492,7 @@
           </w:tcPr>
           <w:p>
             <w:r>
-              <w:t>Medium</w:t>
+              <w:t>High</w:t>
             </w:r>
           </w:p>
         </w:tc>
@@ -1502,7 +1502,7 @@
           </w:tcPr>
           <w:p>
             <w:r>
-              <w:t>18 Sep 2026</w:t>
+              <w:t>18 Sep 2026; reconfirmed 21 Sep 2026</w:t>
             </w:r>
           </w:p>
         </w:tc>
@@ -1544,7 +1544,7 @@
           </w:tcPr>
           <w:p>
             <w:r>
-              <w:t>Accept on a pending rental opens Assign machine with KA13Z2117 selected. Copy says "All operators are busy for this slot. Confirm the machine now and assign an operator later." The only operator in Select an operator (Nauman Majid Pathan) is greyed and does not assign. Confirm stays disabled, so Accept cannot complete. Expected: Confirm is enabled so the vendor can confirm the machine now without an operator, matching the copy; or at least one operator in the list is selectable. Observed 18 Sep 2026 on com.l2b.app.qa with 9000000001 (QuickBookingAcceptTest.acceptOneRentalCard, Allure confirmEnabledAfterAssign=false, assignedOperator=Nauman Majid Pathan). Reconfirmed 23 Sep 2026 on L2B-RNT-2026-1837E2: UI Accept opened Assign with busy-operator copy and Confirm stayed disabled; API accept+assign (allow_operator_overlap) completed Start OTP 9477 / End OTP 5400 to completed. Free-operator UI Confirm verify pending.</w:t>
+              <w:t>Accept on a pending rental opens Assign machine with KA13Z2117 selected. When all operators are busy for the slot, copy says "All operators are busy for this slot. Confirm the machine now and assign an operator later." The only operator in Select an operator (Nauman Majid Pathan) is greyed and does not assign. Confirm stays disabled, so Accept cannot complete. Expected: Confirm is enabled so the vendor can confirm the machine now without an operator, matching the copy; or at least one operator in the list is selectable. Observed 18 Sep 2026 on com.l2b.app.qa with 9000000001 (QuickBookingAcceptTest.acceptOneRentalCard, Allure confirmEnabledAfterAssign=false). SCOPED 23 Sep 2026: free-operator UI happy path PASSES — seed L2B-RNT-2026-F7D066 (RB-FREE-OP-UI, Oct 12–13), API all_operators_busy=false / Nauman is_available=true; Appium FreeOperatorUiAcceptTest.freeOperatorAcceptAssignConfirm Accept → select Nauman → Confirm enabled → toast "Order accepted successfully", booking status operator_assigned. So #16 is busy-slot Confirm/operator-greyout only — Confirm is not broken for free operators.</w:t>
             </w:r>
           </w:p>
         </w:tc>
@@ -1565,6 +1565,626 @@
           <w:p>
             <w:r>
               <w:t>18 Sep 2026</w:t>
+            </w:r>
+          </w:p>
+        </w:tc>
+        <w:tc>
+          <w:tcPr>
+            <w:tcW w:type="dxa" w:w="2304"/>
+          </w:tcPr>
+          <w:p>
+            <w:r>
+              <w:t>Open</w:t>
+            </w:r>
+          </w:p>
+        </w:tc>
+      </w:tr>
+      <w:tr>
+        <w:tc>
+          <w:tcPr>
+            <w:tcW w:type="dxa" w:w="2304"/>
+          </w:tcPr>
+          <w:p>
+            <w:r>
+              <w:t>17</w:t>
+            </w:r>
+          </w:p>
+        </w:tc>
+        <w:tc>
+          <w:tcPr>
+            <w:tcW w:type="dxa" w:w="2304"/>
+          </w:tcPr>
+          <w:p>
+            <w:r>
+              <w:t>Home</w:t>
+            </w:r>
+          </w:p>
+        </w:tc>
+        <w:tc>
+          <w:tcPr>
+            <w:tcW w:type="dxa" w:w="2304"/>
+          </w:tcPr>
+          <w:p>
+            <w:r>
+              <w:t>Pressing device Back on Home exits Vendor to the Android launcher (com.google.android.apps.nexuslauncher). Home earning chrome is gone after one Back. Expected: Back on the logged-in Home root stays in Vendor (or asks to exit) instead of dropping to the launcher. Observed 21 Sep 2026 on com.l2b.app.qa with 9000000017 (HomeEdgeTest.backOnHome, Allure package=com.google.android.apps.nexuslauncher, home=false, launcher=true). This is a Home-screen bug — do not fold into #13 (Quick Booking Back).</w:t>
+            </w:r>
+          </w:p>
+        </w:tc>
+        <w:tc>
+          <w:tcPr>
+            <w:tcW w:type="dxa" w:w="2304"/>
+          </w:tcPr>
+          <w:p>
+            <w:r>
+              <w:t>Medium</w:t>
+            </w:r>
+          </w:p>
+        </w:tc>
+        <w:tc>
+          <w:tcPr>
+            <w:tcW w:type="dxa" w:w="2304"/>
+          </w:tcPr>
+          <w:p>
+            <w:r>
+              <w:t>21 Sep 2026</w:t>
+            </w:r>
+          </w:p>
+        </w:tc>
+        <w:tc>
+          <w:tcPr>
+            <w:tcW w:type="dxa" w:w="2304"/>
+          </w:tcPr>
+          <w:p>
+            <w:r>
+              <w:t>Open</w:t>
+            </w:r>
+          </w:p>
+        </w:tc>
+      </w:tr>
+      <w:tr>
+        <w:tc>
+          <w:tcPr>
+            <w:tcW w:type="dxa" w:w="2304"/>
+          </w:tcPr>
+          <w:p>
+            <w:r>
+              <w:t>18</w:t>
+            </w:r>
+          </w:p>
+        </w:tc>
+        <w:tc>
+          <w:tcPr>
+            <w:tcW w:type="dxa" w:w="2304"/>
+          </w:tcPr>
+          <w:p>
+            <w:r>
+              <w:t>Home</w:t>
+            </w:r>
+          </w:p>
+        </w:tc>
+        <w:tc>
+          <w:tcPr>
+            <w:tcW w:type="dxa" w:w="2304"/>
+          </w:tcPr>
+          <w:p>
+            <w:r>
+              <w:t>Rotating Home to landscape opens the account/profile drawer (Account + Log Out) and hides Current Earning. Restoring portrait leaves the drawer open. Expected: rotation keeps Home content visible with the drawer closed. Observed 21 Sep 2026 on com.l2b.app.qa with 9000000017 (HomeEdgeTest.rotationKeepsHome, Allure drawerLandscape=true, drawerPortrait=true, homeLandscape=false, homePortrait=false). New Home number — do not fold into #14 (Quick Booking rapid-Close).</w:t>
+            </w:r>
+          </w:p>
+        </w:tc>
+        <w:tc>
+          <w:tcPr>
+            <w:tcW w:type="dxa" w:w="2304"/>
+          </w:tcPr>
+          <w:p>
+            <w:r>
+              <w:t>Medium</w:t>
+            </w:r>
+          </w:p>
+        </w:tc>
+        <w:tc>
+          <w:tcPr>
+            <w:tcW w:type="dxa" w:w="2304"/>
+          </w:tcPr>
+          <w:p>
+            <w:r>
+              <w:t>21 Sep 2026</w:t>
+            </w:r>
+          </w:p>
+        </w:tc>
+        <w:tc>
+          <w:tcPr>
+            <w:tcW w:type="dxa" w:w="2304"/>
+          </w:tcPr>
+          <w:p>
+            <w:r>
+              <w:t>Open</w:t>
+            </w:r>
+          </w:p>
+        </w:tc>
+      </w:tr>
+      <w:tr>
+        <w:tc>
+          <w:tcPr>
+            <w:tcW w:type="dxa" w:w="2304"/>
+          </w:tcPr>
+          <w:p>
+            <w:r>
+              <w:t>19</w:t>
+            </w:r>
+          </w:p>
+        </w:tc>
+        <w:tc>
+          <w:tcPr>
+            <w:tcW w:type="dxa" w:w="2304"/>
+          </w:tcPr>
+          <w:p>
+            <w:r>
+              <w:t>Splash screen</w:t>
+            </w:r>
+          </w:p>
+        </w:tc>
+        <w:tc>
+          <w:tcPr>
+            <w:tcW w:type="dxa" w:w="2304"/>
+          </w:tcPr>
+          <w:p>
+            <w:r>
+              <w:t>On cold start, the splash logo paints twice. The Android 12+ system splash (Theme.L2BVendor.Splash, windowSplashScreenAnimatedIcon, ic_splash_logo_layered) exits with its animation (~0.69s in), and the in-app Compose splash then redraws the same logo again (ic_splash_logo / SplashViewModel SPLASH_DISPLAY_MS) before proceeding to the first real screen (Language on first launch, or last route if logged in). Purely visual — no crash; the app still reaches the correct destination. Confirmed 21 Sep 2026 on com.l2b.app.qa: pixel diff of 21,780 px in the logo band (rows 1059–1357) between the first splash frame and the next; then pixel-identical until destination. Logcat: FrameTracker force-finishes J&lt;SPLASHSCREEN_EXIT_ANIM&gt; at the same moment. Expected: one splash, then the first real screen. Dev fix: keep only the Android 12+ system splash until Language/home is ready; do not compose a second splash with ic_splash_logo — keepOnScreen should drop into the destination, not into another logo. New splash number — do not fold into #1 (offline missing error).</w:t>
+            </w:r>
+          </w:p>
+        </w:tc>
+        <w:tc>
+          <w:tcPr>
+            <w:tcW w:type="dxa" w:w="2304"/>
+          </w:tcPr>
+          <w:p>
+            <w:r>
+              <w:t>Low</w:t>
+            </w:r>
+          </w:p>
+        </w:tc>
+        <w:tc>
+          <w:tcPr>
+            <w:tcW w:type="dxa" w:w="2304"/>
+          </w:tcPr>
+          <w:p>
+            <w:r>
+              <w:t>21 Sep 2026</w:t>
+            </w:r>
+          </w:p>
+        </w:tc>
+        <w:tc>
+          <w:tcPr>
+            <w:tcW w:type="dxa" w:w="2304"/>
+          </w:tcPr>
+          <w:p>
+            <w:r>
+              <w:t>Open</w:t>
+            </w:r>
+          </w:p>
+        </w:tc>
+      </w:tr>
+      <w:tr>
+        <w:tc>
+          <w:tcPr>
+            <w:tcW w:type="dxa" w:w="2304"/>
+          </w:tcPr>
+          <w:p>
+            <w:r>
+              <w:t>20</w:t>
+            </w:r>
+          </w:p>
+        </w:tc>
+        <w:tc>
+          <w:tcPr>
+            <w:tcW w:type="dxa" w:w="2304"/>
+          </w:tcPr>
+          <w:p>
+            <w:r>
+              <w:t>Rental Home</w:t>
+            </w:r>
+          </w:p>
+        </w:tc>
+        <w:tc>
+          <w:tcPr>
+            <w:tcW w:type="dxa" w:w="2304"/>
+          </w:tcPr>
+          <w:p>
+            <w:r>
+              <w:t>First Upcoming Booking card on Rental Home shows the label Booking for with an empty address. UiAutomator dump 21 Sep (/tmp/l2b-rental-flow-0001-20260921/01-after-close) has a TextView under Booking for with text="". Screenshot docs/rental-flow/screens/home.png shows a blank line under the pin. Figma Home Screen (Vendor App Dev Team file, Rental Vendor Flow Design, node 1-5280) shows a full address under Booking for (e.g. Ameerpet Hyderabad). Expected: the location line is visible and non-empty, matching Figma. Observed on com.l2b.app.qa with 9000000001. Do not fold into Material Home #17/#18.</w:t>
+            </w:r>
+          </w:p>
+        </w:tc>
+        <w:tc>
+          <w:tcPr>
+            <w:tcW w:type="dxa" w:w="2304"/>
+          </w:tcPr>
+          <w:p>
+            <w:r>
+              <w:t>Medium</w:t>
+            </w:r>
+          </w:p>
+        </w:tc>
+        <w:tc>
+          <w:tcPr>
+            <w:tcW w:type="dxa" w:w="2304"/>
+          </w:tcPr>
+          <w:p>
+            <w:r>
+              <w:t>21 Sep 2026</w:t>
+            </w:r>
+          </w:p>
+        </w:tc>
+        <w:tc>
+          <w:tcPr>
+            <w:tcW w:type="dxa" w:w="2304"/>
+          </w:tcPr>
+          <w:p>
+            <w:r>
+              <w:t>Open</w:t>
+            </w:r>
+          </w:p>
+        </w:tc>
+      </w:tr>
+      <w:tr>
+        <w:tc>
+          <w:tcPr>
+            <w:tcW w:type="dxa" w:w="2304"/>
+          </w:tcPr>
+          <w:p>
+            <w:r>
+              <w:t>21</w:t>
+            </w:r>
+          </w:p>
+        </w:tc>
+        <w:tc>
+          <w:tcPr>
+            <w:tcW w:type="dxa" w:w="2304"/>
+          </w:tcPr>
+          <w:p>
+            <w:r>
+              <w:t>Rental Home</w:t>
+            </w:r>
+          </w:p>
+        </w:tc>
+        <w:tc>
+          <w:tcPr>
+            <w:tcW w:type="dxa" w:w="2304"/>
+          </w:tcPr>
+          <w:p>
+            <w:r>
+              <w:t>Upcoming Booking strip card on Rental Home is missing the green Assign control from Figma Home Screen. Figma places Assign beside the date on the Home upcoming card. Live dump 01-after-close and screenshot show machine name, plate (KA13Z2117), dates, and Booking for only — no Assign text or content-desc. Expected: Assign is visible on the Home upcoming card so the vendor can assign from Home, matching Figma. Observed 21 Sep 2026 on com.l2b.app.qa with 9000000001. New Rental Home number — do not fold into #16 (Assign machine sheet after Accept).</w:t>
+            </w:r>
+          </w:p>
+        </w:tc>
+        <w:tc>
+          <w:tcPr>
+            <w:tcW w:type="dxa" w:w="2304"/>
+          </w:tcPr>
+          <w:p>
+            <w:r>
+              <w:t>Medium</w:t>
+            </w:r>
+          </w:p>
+        </w:tc>
+        <w:tc>
+          <w:tcPr>
+            <w:tcW w:type="dxa" w:w="2304"/>
+          </w:tcPr>
+          <w:p>
+            <w:r>
+              <w:t>21 Sep 2026</w:t>
+            </w:r>
+          </w:p>
+        </w:tc>
+        <w:tc>
+          <w:tcPr>
+            <w:tcW w:type="dxa" w:w="2304"/>
+          </w:tcPr>
+          <w:p>
+            <w:r>
+              <w:t>Open</w:t>
+            </w:r>
+          </w:p>
+        </w:tc>
+      </w:tr>
+      <w:tr>
+        <w:tc>
+          <w:tcPr>
+            <w:tcW w:type="dxa" w:w="2304"/>
+          </w:tcPr>
+          <w:p>
+            <w:r>
+              <w:t>22</w:t>
+            </w:r>
+          </w:p>
+        </w:tc>
+        <w:tc>
+          <w:tcPr>
+            <w:tcW w:type="dxa" w:w="2304"/>
+          </w:tcPr>
+          <w:p>
+            <w:r>
+              <w:t>Rental Home</w:t>
+            </w:r>
+          </w:p>
+        </w:tc>
+        <w:tc>
+          <w:tcPr>
+            <w:tcW w:type="dxa" w:w="2304"/>
+          </w:tcPr>
+          <w:p>
+            <w:r>
+              <w:t>Home Booking Orders card does not match Figma Home Screen. Figma: View More Details under Decline/Accept, two location pins, no timer. Live 0001 dump/screenshot: Timer (30:00), one Booking for location, no View More Details. Decline and Accept are present on both (tests did not tap them). Expected: the Home feed card includes View More Details and the two-location row from Figma. Observed 21 Sep 2026 on com.l2b.app.qa with 9000000001. New Rental Home number — do not fold into Quick Booking landing View More Details.</w:t>
+            </w:r>
+          </w:p>
+        </w:tc>
+        <w:tc>
+          <w:tcPr>
+            <w:tcW w:type="dxa" w:w="2304"/>
+          </w:tcPr>
+          <w:p>
+            <w:r>
+              <w:t>Medium</w:t>
+            </w:r>
+          </w:p>
+        </w:tc>
+        <w:tc>
+          <w:tcPr>
+            <w:tcW w:type="dxa" w:w="2304"/>
+          </w:tcPr>
+          <w:p>
+            <w:r>
+              <w:t>21 Sep 2026</w:t>
+            </w:r>
+          </w:p>
+        </w:tc>
+        <w:tc>
+          <w:tcPr>
+            <w:tcW w:type="dxa" w:w="2304"/>
+          </w:tcPr>
+          <w:p>
+            <w:r>
+              <w:t>Open</w:t>
+            </w:r>
+          </w:p>
+        </w:tc>
+      </w:tr>
+      <w:tr>
+        <w:tc>
+          <w:tcPr>
+            <w:tcW w:type="dxa" w:w="2304"/>
+          </w:tcPr>
+          <w:p>
+            <w:r>
+              <w:t>23</w:t>
+            </w:r>
+          </w:p>
+        </w:tc>
+        <w:tc>
+          <w:tcPr>
+            <w:tcW w:type="dxa" w:w="2304"/>
+          </w:tcPr>
+          <w:p>
+            <w:r>
+              <w:t>Rental Home</w:t>
+            </w:r>
+          </w:p>
+        </w:tc>
+        <w:tc>
+          <w:tcPr>
+            <w:tcW w:type="dxa" w:w="2304"/>
+          </w:tcPr>
+          <w:p>
+            <w:r>
+              <w:t>Total Completed Task subtitle on Rental Home is "New this month". Figma Home Screen uses a percent-vs-last-months line on that card ("+14% Last Months"), same pattern as Upcoming Booking and Earning Projected. Live dump: count 1 + New this month; the other two stats use +N% vs last month. Expected: Completed Task uses the same trend treatment as Figma / the sibling stat cards. Observed 22 Sep 2026 on com.l2b.app.qa with 9000000001.</w:t>
+            </w:r>
+          </w:p>
+        </w:tc>
+        <w:tc>
+          <w:tcPr>
+            <w:tcW w:type="dxa" w:w="2304"/>
+          </w:tcPr>
+          <w:p>
+            <w:r>
+              <w:t>Low</w:t>
+            </w:r>
+          </w:p>
+        </w:tc>
+        <w:tc>
+          <w:tcPr>
+            <w:tcW w:type="dxa" w:w="2304"/>
+          </w:tcPr>
+          <w:p>
+            <w:r>
+              <w:t>22 Sep 2026</w:t>
+            </w:r>
+          </w:p>
+        </w:tc>
+        <w:tc>
+          <w:tcPr>
+            <w:tcW w:type="dxa" w:w="2304"/>
+          </w:tcPr>
+          <w:p>
+            <w:r>
+              <w:t>Open</w:t>
+            </w:r>
+          </w:p>
+        </w:tc>
+      </w:tr>
+      <w:tr>
+        <w:tc>
+          <w:tcPr>
+            <w:tcW w:type="dxa" w:w="2304"/>
+          </w:tcPr>
+          <w:p>
+            <w:r>
+              <w:t>24</w:t>
+            </w:r>
+          </w:p>
+        </w:tc>
+        <w:tc>
+          <w:tcPr>
+            <w:tcW w:type="dxa" w:w="2304"/>
+          </w:tcPr>
+          <w:p>
+            <w:r>
+              <w:t>Rental Home</w:t>
+            </w:r>
+          </w:p>
+        </w:tc>
+        <w:tc>
+          <w:tcPr>
+            <w:tcW w:type="dxa" w:w="2304"/>
+          </w:tcPr>
+          <w:p>
+            <w:r>
+              <w:t>Rupee amounts on Rental Home use Western thousands grouping (Earning Projected ₹ 769,250) while Figma Home Screen uses Indian grouping (₹ 6,00,000 Current Earning, ₹ 1,00,000 Earning Projected). Five-digit Current Earning ₹ 93,744 does not show the difference. Expected: Indian lakh/crore grouping on Home earning figures to match Figma. Observed 22 Sep 2026 on com.l2b.app.qa with 9000000001.</w:t>
+            </w:r>
+          </w:p>
+        </w:tc>
+        <w:tc>
+          <w:tcPr>
+            <w:tcW w:type="dxa" w:w="2304"/>
+          </w:tcPr>
+          <w:p>
+            <w:r>
+              <w:t>Low</w:t>
+            </w:r>
+          </w:p>
+        </w:tc>
+        <w:tc>
+          <w:tcPr>
+            <w:tcW w:type="dxa" w:w="2304"/>
+          </w:tcPr>
+          <w:p>
+            <w:r>
+              <w:t>22 Sep 2026</w:t>
+            </w:r>
+          </w:p>
+        </w:tc>
+        <w:tc>
+          <w:tcPr>
+            <w:tcW w:type="dxa" w:w="2304"/>
+          </w:tcPr>
+          <w:p>
+            <w:r>
+              <w:t>Open</w:t>
+            </w:r>
+          </w:p>
+        </w:tc>
+      </w:tr>
+      <w:tr>
+        <w:tc>
+          <w:tcPr>
+            <w:tcW w:type="dxa" w:w="2304"/>
+          </w:tcPr>
+          <w:p>
+            <w:r>
+              <w:t>25</w:t>
+            </w:r>
+          </w:p>
+        </w:tc>
+        <w:tc>
+          <w:tcPr>
+            <w:tcW w:type="dxa" w:w="2304"/>
+          </w:tcPr>
+          <w:p>
+            <w:r>
+              <w:t>Rental Home</w:t>
+            </w:r>
+          </w:p>
+        </w:tc>
+        <w:tc>
+          <w:tcPr>
+            <w:tcW w:type="dxa" w:w="2304"/>
+          </w:tcPr>
+          <w:p>
+            <w:r>
+              <w:t>Pressing device Back on Rental Home exits Vendor to the Android launcher (com.google.android.apps.nexuslauncher). Home greeting, earning, and rental tabs are gone after one Back. Expected: Back on the logged-in Rental Home root stays in Vendor (or asks to exit) instead of dropping to the launcher. Observed 22 Sep 2026 on com.l2b.app.qa with 9000000001 (RentalHomeEdgeTest.backOnHome, Allure package=com.google.android.apps.nexuslauncher, after=launcher). A first Upcoming strip swipe that started too close to the left edge also landed on the launcher (RentalHomeLandingTest.upcomingStripHorizontalSwipe) — same Back-to-launcher path, not a second number. New Rental Home number — do not fold into #13 (Quick Booking Back) or #17 (material Home Back on 9000000017).</w:t>
+            </w:r>
+          </w:p>
+        </w:tc>
+        <w:tc>
+          <w:tcPr>
+            <w:tcW w:type="dxa" w:w="2304"/>
+          </w:tcPr>
+          <w:p>
+            <w:r>
+              <w:t>Medium</w:t>
+            </w:r>
+          </w:p>
+        </w:tc>
+        <w:tc>
+          <w:tcPr>
+            <w:tcW w:type="dxa" w:w="2304"/>
+          </w:tcPr>
+          <w:p>
+            <w:r>
+              <w:t>22 Sep 2026</w:t>
+            </w:r>
+          </w:p>
+        </w:tc>
+        <w:tc>
+          <w:tcPr>
+            <w:tcW w:type="dxa" w:w="2304"/>
+          </w:tcPr>
+          <w:p>
+            <w:r>
+              <w:t>Open</w:t>
+            </w:r>
+          </w:p>
+        </w:tc>
+      </w:tr>
+      <w:tr>
+        <w:tc>
+          <w:tcPr>
+            <w:tcW w:type="dxa" w:w="2304"/>
+          </w:tcPr>
+          <w:p>
+            <w:r>
+              <w:t>26</w:t>
+            </w:r>
+          </w:p>
+        </w:tc>
+        <w:tc>
+          <w:tcPr>
+            <w:tcW w:type="dxa" w:w="2304"/>
+          </w:tcPr>
+          <w:p>
+            <w:r>
+              <w:t>Rental Home</w:t>
+            </w:r>
+          </w:p>
+        </w:tc>
+        <w:tc>
+          <w:tcPr>
+            <w:tcW w:type="dxa" w:w="2304"/>
+          </w:tcPr>
+          <w:p>
+            <w:r>
+              <w:t>Rotating Rental Home to landscape opens the account/profile drawer (Account, KYC, Your machines, Log Out) and hides Current Earning. Restoring portrait leaves the drawer open. Expected: rotation keeps Home content visible with the drawer closed. Observed 22 Sep 2026 on com.l2b.app.qa with 9000000001 (RentalHomeEdgeTest.rotationKeepsHome, Allure drawerLandscape=true, drawerPortrait=true, homeLandscape=false, homePortrait=false). New Rental Home number — do not fold into #18 (material Home rotation on 9000000017).</w:t>
+            </w:r>
+          </w:p>
+        </w:tc>
+        <w:tc>
+          <w:tcPr>
+            <w:tcW w:type="dxa" w:w="2304"/>
+          </w:tcPr>
+          <w:p>
+            <w:r>
+              <w:t>Medium</w:t>
+            </w:r>
+          </w:p>
+        </w:tc>
+        <w:tc>
+          <w:tcPr>
+            <w:tcW w:type="dxa" w:w="2304"/>
+          </w:tcPr>
+          <w:p>
+            <w:r>
+              <w:t>22 Sep 2026</w:t>
             </w:r>
           </w:p>
         </w:tc>

</xml_diff>